<commit_message>
added more to the html and created color palette for the site
</commit_message>
<xml_diff>
--- a/Survey Site Info.docx
+++ b/Survey Site Info.docx
@@ -513,6 +513,196 @@
       <w:r>
         <w:lastRenderedPageBreak/>
         <w:t>PHASE #2:</w:t>
+      </w:r>
+    </w:p>
+    <w:p>
+      <w:r>
+        <w:t>Potential site names: Some key words to use: data, survey, stat/statistics</w:t>
+      </w:r>
+    </w:p>
+    <w:p>
+      <w:r>
+        <w:t xml:space="preserve">Data + time, mining, </w:t>
+      </w:r>
+    </w:p>
+    <w:p>
+      <w:r>
+        <w:t xml:space="preserve">Survey + me, </w:t>
+      </w:r>
+    </w:p>
+    <w:p>
+      <w:r>
+        <w:t xml:space="preserve">Stat + </w:t>
+      </w:r>
+      <w:proofErr w:type="spellStart"/>
+      <w:r>
+        <w:t>sify</w:t>
+      </w:r>
+      <w:proofErr w:type="spellEnd"/>
+      <w:r>
+        <w:t xml:space="preserve">, </w:t>
+      </w:r>
+    </w:p>
+    <w:p/>
+    <w:p>
+      <w:r>
+        <w:t>FILE PATH</w:t>
+      </w:r>
+    </w:p>
+    <w:p>
+      <w:r>
+        <w:t>root/</w:t>
+      </w:r>
+    </w:p>
+    <w:p>
+      <w:r>
+        <w:rPr>
+          <w:rFonts w:ascii="MS Gothic" w:eastAsia="MS Gothic" w:hAnsi="MS Gothic" w:cs="MS Gothic" w:hint="eastAsia"/>
+        </w:rPr>
+        <w:t>├</w:t>
+      </w:r>
+      <w:r>
+        <w:t>── charts/</w:t>
+      </w:r>
+    </w:p>
+    <w:p>
+      <w:r>
+        <w:t>│   └── charts.py</w:t>
+      </w:r>
+    </w:p>
+    <w:p>
+      <w:r>
+        <w:rPr>
+          <w:rFonts w:ascii="MS Gothic" w:eastAsia="MS Gothic" w:hAnsi="MS Gothic" w:cs="MS Gothic" w:hint="eastAsia"/>
+        </w:rPr>
+        <w:t>├</w:t>
+      </w:r>
+      <w:r>
+        <w:t xml:space="preserve">── </w:t>
+      </w:r>
+      <w:proofErr w:type="spellStart"/>
+      <w:r>
+        <w:t>css</w:t>
+      </w:r>
+      <w:proofErr w:type="spellEnd"/>
+      <w:r>
+        <w:t>/</w:t>
+      </w:r>
+    </w:p>
+    <w:p>
+      <w:r>
+        <w:t xml:space="preserve">│   </w:t>
+      </w:r>
+      <w:r>
+        <w:rPr>
+          <w:rFonts w:ascii="MS Gothic" w:eastAsia="MS Gothic" w:hAnsi="MS Gothic" w:cs="MS Gothic" w:hint="eastAsia"/>
+        </w:rPr>
+        <w:t>├</w:t>
+      </w:r>
+      <w:r>
+        <w:t>── index.css</w:t>
+      </w:r>
+    </w:p>
+    <w:p>
+      <w:r>
+        <w:t>│   └── results.css</w:t>
+      </w:r>
+    </w:p>
+    <w:p>
+      <w:r>
+        <w:rPr>
+          <w:rFonts w:ascii="MS Gothic" w:eastAsia="MS Gothic" w:hAnsi="MS Gothic" w:cs="MS Gothic" w:hint="eastAsia"/>
+        </w:rPr>
+        <w:t>├</w:t>
+      </w:r>
+      <w:r>
+        <w:t>── database/</w:t>
+      </w:r>
+    </w:p>
+    <w:p>
+      <w:r>
+        <w:t xml:space="preserve">│   └── </w:t>
+      </w:r>
+      <w:proofErr w:type="spellStart"/>
+      <w:r>
+        <w:t>schema.sql</w:t>
+      </w:r>
+      <w:proofErr w:type="spellEnd"/>
+    </w:p>
+    <w:p>
+      <w:r>
+        <w:rPr>
+          <w:rFonts w:ascii="MS Gothic" w:eastAsia="MS Gothic" w:hAnsi="MS Gothic" w:cs="MS Gothic" w:hint="eastAsia"/>
+        </w:rPr>
+        <w:t>├</w:t>
+      </w:r>
+      <w:r>
+        <w:t>── images/</w:t>
+      </w:r>
+    </w:p>
+    <w:p>
+      <w:r>
+        <w:rPr>
+          <w:rFonts w:ascii="MS Gothic" w:eastAsia="MS Gothic" w:hAnsi="MS Gothic" w:cs="MS Gothic" w:hint="eastAsia"/>
+        </w:rPr>
+        <w:t>├</w:t>
+      </w:r>
+      <w:r>
+        <w:t xml:space="preserve">── </w:t>
+      </w:r>
+      <w:proofErr w:type="spellStart"/>
+      <w:r>
+        <w:t>js</w:t>
+      </w:r>
+      <w:proofErr w:type="spellEnd"/>
+      <w:r>
+        <w:t>/</w:t>
+      </w:r>
+    </w:p>
+    <w:p>
+      <w:r>
+        <w:t xml:space="preserve">│   </w:t>
+      </w:r>
+      <w:r>
+        <w:rPr>
+          <w:rFonts w:ascii="MS Gothic" w:eastAsia="MS Gothic" w:hAnsi="MS Gothic" w:cs="MS Gothic" w:hint="eastAsia"/>
+        </w:rPr>
+        <w:t>├</w:t>
+      </w:r>
+      <w:r>
+        <w:t>── index.js</w:t>
+      </w:r>
+    </w:p>
+    <w:p>
+      <w:r>
+        <w:t>│   └── results.js</w:t>
+      </w:r>
+    </w:p>
+    <w:p>
+      <w:r>
+        <w:rPr>
+          <w:rFonts w:ascii="MS Gothic" w:eastAsia="MS Gothic" w:hAnsi="MS Gothic" w:cs="MS Gothic" w:hint="eastAsia"/>
+        </w:rPr>
+        <w:t>├</w:t>
+      </w:r>
+      <w:r>
+        <w:t>── index.html</w:t>
+      </w:r>
+    </w:p>
+    <w:p>
+      <w:r>
+        <w:rPr>
+          <w:rFonts w:ascii="MS Gothic" w:eastAsia="MS Gothic" w:hAnsi="MS Gothic" w:cs="MS Gothic" w:hint="eastAsia"/>
+        </w:rPr>
+        <w:t>├</w:t>
+      </w:r>
+      <w:r>
+        <w:t>── results.html</w:t>
+      </w:r>
+    </w:p>
+    <w:p>
+      <w:r>
+        <w:t>└── survey_site_info.doc</w:t>
       </w:r>
     </w:p>
     <w:sectPr>

</xml_diff>

<commit_message>
updated the site to look more like the wireframe. mostly a bunch of css
</commit_message>
<xml_diff>
--- a/Survey Site Info.docx
+++ b/Survey Site Info.docx
@@ -703,6 +703,70 @@
     <w:p>
       <w:r>
         <w:t>└── survey_site_info.doc</w:t>
+      </w:r>
+    </w:p>
+    <w:p>
+      <w:r>
+        <w:br w:type="page"/>
+      </w:r>
+    </w:p>
+    <w:p>
+      <w:r>
+        <w:lastRenderedPageBreak/>
+        <w:t>COLOR PALATTE:</w:t>
+      </w:r>
+    </w:p>
+    <w:p>
+      <w:r>
+        <w:rPr>
+          <w:noProof/>
+        </w:rPr>
+        <w:drawing>
+          <wp:inline distT="0" distB="0" distL="0" distR="0" wp14:anchorId="74E8F629" wp14:editId="470694B8">
+            <wp:extent cx="2336800" cy="7162800"/>
+            <wp:effectExtent l="12700" t="12700" r="12700" b="12700"/>
+            <wp:docPr id="486903541" name="Picture 1" descr="A blue and grey color&#10;&#10;AI-generated content may be incorrect."/>
+            <wp:cNvGraphicFramePr>
+              <a:graphicFrameLocks xmlns:a="http://schemas.openxmlformats.org/drawingml/2006/main" noChangeAspect="1"/>
+            </wp:cNvGraphicFramePr>
+            <a:graphic xmlns:a="http://schemas.openxmlformats.org/drawingml/2006/main">
+              <a:graphicData uri="http://schemas.openxmlformats.org/drawingml/2006/picture">
+                <pic:pic xmlns:pic="http://schemas.openxmlformats.org/drawingml/2006/picture">
+                  <pic:nvPicPr>
+                    <pic:cNvPr id="486903541" name="Picture 1" descr="A blue and grey color&#10;&#10;AI-generated content may be incorrect."/>
+                    <pic:cNvPicPr/>
+                  </pic:nvPicPr>
+                  <pic:blipFill>
+                    <a:blip r:embed="rId7">
+                      <a:extLst>
+                        <a:ext uri="{28A0092B-C50C-407E-A947-70E740481C1C}">
+                          <a14:useLocalDpi xmlns:a14="http://schemas.microsoft.com/office/drawing/2010/main" val="0"/>
+                        </a:ext>
+                      </a:extLst>
+                    </a:blip>
+                    <a:stretch>
+                      <a:fillRect/>
+                    </a:stretch>
+                  </pic:blipFill>
+                  <pic:spPr>
+                    <a:xfrm>
+                      <a:off x="0" y="0"/>
+                      <a:ext cx="2336800" cy="7162800"/>
+                    </a:xfrm>
+                    <a:prstGeom prst="rect">
+                      <a:avLst/>
+                    </a:prstGeom>
+                    <a:ln>
+                      <a:solidFill>
+                        <a:schemeClr val="tx1"/>
+                      </a:solidFill>
+                    </a:ln>
+                  </pic:spPr>
+                </pic:pic>
+              </a:graphicData>
+            </a:graphic>
+          </wp:inline>
+        </w:drawing>
       </w:r>
     </w:p>
     <w:sectPr>

</xml_diff>